<commit_message>
Fix letterhead: keep Dankah logo clear of the page frame
Co-Authored-By: Claude Sonnet 5.5 <noreply@anthropic.com>
Claude-Session: https://claude.ai/code/session_018rzKLsU8BEuNNdC8ziapie
</commit_message>
<xml_diff>
--- a/consignacao/termo/Termo_Consignacao_Quetzalli_timbrado.docx
+++ b/consignacao/termo/Termo_Consignacao_Quetzalli_timbrado.docx
@@ -4653,6 +4653,11 @@
         </wp:anchor>
       </w:drawing>
     </w:r>
+  </w:p>
+  <w:p>
+    <w:pPr>
+      <w:spacing w:before="0" w:after="0" w:lineRule="exact" w:line="520"/>
+    </w:pPr>
   </w:p>
 </w:hdr>
 </file>

</xml_diff>